<commit_message>
session1 slide update - mechanism added
</commit_message>
<xml_diff>
--- a/docs/cuesheet-session1.docx
+++ b/docs/cuesheet-session1.docx
@@ -187,13 +187,48 @@
         <w:pStyle w:val="BodyText"/>
       </w:pPr>
       <w:r>
-        <w:t xml:space="preserve">시간 배분: 도입 5분 → 개념 25분(슬라이드 3~15, 장당 약 2분) → Lab 1 10분 →</w:t>
-      </w:r>
-      <w:r>
-        <w:t xml:space="preserve"> </w:t>
-      </w:r>
-      <w:r>
-        <w:t xml:space="preserve">Lab 2~4 15분 → 마무리 5분.</w:t>
+        <w:t xml:space="preserve">시간 배분: 도입 5분 → 개념 25분(슬라이드 4~15) → Lab 1 10분 → Lab 2~4 15분 →</w:t>
+      </w:r>
+      <w:r>
+        <w:t xml:space="preserve"> </w:t>
+      </w:r>
+      <w:r>
+        <w:t xml:space="preserve">마무리 5분.</w:t>
+      </w:r>
+    </w:p>
+    <w:p>
+      <w:pPr>
+        <w:pStyle w:val="BodyText"/>
+      </w:pPr>
+      <w:r>
+        <w:rPr>
+          <w:b/>
+        </w:rPr>
+        <w:t xml:space="preserve">개념 구간의 중심은 슬라이드 6·7·8(메커니즘 3부작)입니다.</w:t>
+      </w:r>
+      <w:r>
+        <w:t xml:space="preserve"> </w:t>
+      </w:r>
+      <w:r>
+        <w:t xml:space="preserve">조인이 실제로</w:t>
+      </w:r>
+      <w:r>
+        <w:t xml:space="preserve"> </w:t>
+      </w:r>
+      <w:r>
+        <w:t xml:space="preserve">무엇을 만드는지 → 티켓이 언제 생기고 어디 있는지 → 무엇으로 잠그고 누가 여는지.</w:t>
+      </w:r>
+      <w:r>
+        <w:t xml:space="preserve"> </w:t>
+      </w:r>
+      <w:r>
+        <w:t xml:space="preserve">이 세 장에 각 2.5분씩 쓰고, 나머지 개념 슬라이드는 1~2분으로 넘기세요. 슬라이드</w:t>
+      </w:r>
+      <w:r>
+        <w:t xml:space="preserve"> </w:t>
+      </w:r>
+      <w:r>
+        <w:t xml:space="preserve">8이 Lab 2(1396)의 직접적인 밑밥입니다.</w:t>
       </w:r>
     </w:p>
     <w:p>
@@ -643,16 +678,22 @@
         <w:t xml:space="preserve"> </w:t>
       </w:r>
       <w:r>
-        <w:t xml:space="preserve">이 덱의 핵심 비유. 여기서 시간을 써도 됨(2.5분).</w:t>
+        <w:t xml:space="preserve">이 덱의 핵심 비유. 여기서 시간을 써도 됨(2분). 바로 다음 세</w:t>
+      </w:r>
+      <w:r>
+        <w:t xml:space="preserve"> </w:t>
+      </w:r>
+      <w:r>
+        <w:t xml:space="preserve">장이 이 이야기를 실제 메커니즘으로 바꿉니다.</w:t>
       </w:r>
     </w:p>
     <w:p>
       <w:pPr>
         <w:pStyle w:val="Heading2"/>
       </w:pPr>
-      <w:bookmarkStart w:id="28" w:name="Xe306bd78565c996fa359c294bbf7c2a1ff7d0d6"/>
-      <w:r>
-        <w:t xml:space="preserve">슬라이드 6 · The same story, with our actors — 0:10</w:t>
+      <w:bookmarkStart w:id="28" w:name="X11c3bfa9f7b4d32c26cbd827fed2b4b1b6be609"/>
+      <w:r>
+        <w:t xml:space="preserve">슬라이드 6 · [메커니즘 1/3] 스토리지 계정을 도메인 조인하면 실제로 일어나는 일 — 0:10</w:t>
       </w:r>
       <w:bookmarkEnd w:id="28"/>
     </w:p>
@@ -673,43 +714,61 @@
         <w:t xml:space="preserve">“</w:t>
       </w:r>
       <w:r>
-        <w:t xml:space="preserve">같은 이야기를 우리 실습 배역으로 치환하면 이렇습니다. KDC는</w:t>
-      </w:r>
-      <w:r>
-        <w:t xml:space="preserve"> </w:t>
-      </w:r>
-      <w:r>
-        <w:t xml:space="preserve">여러분 DC, 클라이언트는 labuser1으로 로그인한 VM. 흥미로운 건 서비스입니다 —</w:t>
-      </w:r>
-      <w:r>
-        <w:t xml:space="preserve"> </w:t>
-      </w:r>
-      <w:r>
-        <w:t xml:space="preserve">스토리지 계정이 AD 안에 ’컴퓨터 계정’으로 존재하고, 그 계정의 비밀번호가</w:t>
-      </w:r>
-      <w:r>
-        <w:t xml:space="preserve"> </w:t>
-      </w:r>
-      <w:r>
-        <w:t xml:space="preserve">스토리지의 kerb1 키입니다. 그리고 SPN이 TGS가 이 서비스를 찾는 주소고요.</w:t>
-      </w:r>
-      <w:r>
-        <w:t xml:space="preserve"> </w:t>
-      </w:r>
-      <w:r>
-        <w:t xml:space="preserve">아래 문장이 오늘의 전부입니다: 스토리지 계정을 도메인 조인한다는 건, 비밀번호가</w:t>
-      </w:r>
-      <w:r>
-        <w:t xml:space="preserve"> </w:t>
-      </w:r>
-      <w:r>
-        <w:t xml:space="preserve">kerb 키이고 SPN이 파일 엔드포인트를 가리키는 AD 계정을 만드는 일입니다. 오늘</w:t>
-      </w:r>
-      <w:r>
-        <w:t xml:space="preserve"> </w:t>
-      </w:r>
-      <w:r>
-        <w:t xml:space="preserve">주입할 장애는 전부 이 삼각형의 한 변을 공격합니다.</w:t>
+        <w:t xml:space="preserve">’스토리지 계정을 도메인에 조인한다’는 말, 실제로 무슨 일이</w:t>
+      </w:r>
+      <w:r>
+        <w:t xml:space="preserve"> </w:t>
+      </w:r>
+      <w:r>
+        <w:t xml:space="preserve">일어나는지 다섯 단계로 봅시다. 1번, Azure가 스토리지 계정에 Kerberos 키 두</w:t>
+      </w:r>
+      <w:r>
+        <w:t xml:space="preserve"> </w:t>
+      </w:r>
+      <w:r>
+        <w:t xml:space="preserve">개를 만듭니다 — kerb1과 kerb2. 이게 이 서비스의 장기 비밀입니다. 2번, 여러분</w:t>
+      </w:r>
+      <w:r>
+        <w:t xml:space="preserve"> </w:t>
+      </w:r>
+      <w:r>
+        <w:t xml:space="preserve">AD에 스토리지 계정을 대표하는 객체를 만듭니다. 보통 컴퓨터 객체인데, 서비스</w:t>
+      </w:r>
+      <w:r>
+        <w:t xml:space="preserve"> </w:t>
+      </w:r>
+      <w:r>
+        <w:t xml:space="preserve">로그온용 사용자 객체도 됩니다. 3번이 핵심입니다 — 그 AD 계정의 비밀번호를</w:t>
+      </w:r>
+      <w:r>
+        <w:t xml:space="preserve"> </w:t>
+      </w:r>
+      <w:r>
+        <w:t xml:space="preserve">kerb1 키로 설정합니다. 이제 AD와 Azure Files가 같은 비밀 하나를 공유하게</w:t>
+      </w:r>
+      <w:r>
+        <w:t xml:space="preserve"> </w:t>
+      </w:r>
+      <w:r>
+        <w:t xml:space="preserve">되는 거죠. 4번, SPN을 등록합니다. KDC가 이 서비스를 찾을 때 쓰는 이름입니다.</w:t>
+      </w:r>
+      <w:r>
+        <w:t xml:space="preserve"> </w:t>
+      </w:r>
+      <w:r>
+        <w:t xml:space="preserve">5번, 반대 방향으로 스토리지 계정에도 도메인 정보를 써 넣습니다. 그래야 Azure</w:t>
+      </w:r>
+      <w:r>
+        <w:t xml:space="preserve"> </w:t>
+      </w:r>
+      <w:r>
+        <w:t xml:space="preserve">Files가 ’나는 이 도메인의 이 계정이다’를 압니다. 아래 문장이 요점입니다 —</w:t>
+      </w:r>
+      <w:r>
+        <w:t xml:space="preserve"> </w:t>
+      </w:r>
+      <w:r>
+        <w:t xml:space="preserve">DC 입장에서 여러분 스토리지 계정은 그냥 도메인의 서버 한 대일 뿐입니다.</w:t>
       </w:r>
       <w:r>
         <w:t xml:space="preserve">”</w:t>
@@ -729,10 +788,16 @@
         <w:t xml:space="preserve"> </w:t>
       </w:r>
       <w:r>
+        <w:t xml:space="preserve">2.5분 배정.</w:t>
+      </w:r>
+      <w:r>
+        <w:t xml:space="preserve"> </w:t>
+      </w:r>
+      <w:r>
         <w:t xml:space="preserve">“</w:t>
       </w:r>
       <w:r>
-        <w:t xml:space="preserve">computer object + SPN + kerb key</w:t>
+        <w:t xml:space="preserve">AD 계정 + 비밀번호=kerb 키 + SPN</w:t>
       </w:r>
       <w:r>
         <w:t xml:space="preserve">”</w:t>
@@ -741,22 +806,22 @@
         <w:t xml:space="preserve"> </w:t>
       </w:r>
       <w:r>
-        <w:t xml:space="preserve">— 이 세 단어를 반복해서</w:t>
-      </w:r>
-      <w:r>
-        <w:t xml:space="preserve"> </w:t>
-      </w:r>
-      <w:r>
-        <w:t xml:space="preserve">각인시킬 것.</w:t>
+        <w:t xml:space="preserve">세 단어를</w:t>
+      </w:r>
+      <w:r>
+        <w:t xml:space="preserve"> </w:t>
+      </w:r>
+      <w:r>
+        <w:t xml:space="preserve">반복. 배포 스크립트 5·6단계가 정확히 이 일을 한다고 예고.</w:t>
       </w:r>
     </w:p>
     <w:p>
       <w:pPr>
         <w:pStyle w:val="Heading2"/>
       </w:pPr>
-      <w:bookmarkStart w:id="29" w:name="X327a1c9ff7f123faf6fedb6c805d240c88a86a0"/>
-      <w:r>
-        <w:t xml:space="preserve">슬라이드 7 · Which identity source fits which client? — 0:12</w:t>
+      <w:bookmarkStart w:id="29" w:name="슬라이드-7-메커니즘-23-티켓은-언제-발급되고-어디에-저장되나-012"/>
+      <w:r>
+        <w:t xml:space="preserve">슬라이드 7 · [메커니즘 2/3] 티켓은 언제 발급되고 어디에 저장되나 — 0:12</w:t>
       </w:r>
       <w:bookmarkEnd w:id="29"/>
     </w:p>
@@ -777,31 +842,55 @@
         <w:t xml:space="preserve">“</w:t>
       </w:r>
       <w:r>
-        <w:t xml:space="preserve">identity 방식이 세 가지라고 했는데, 표로 비교하면 이렇습니다.</w:t>
-      </w:r>
-      <w:r>
-        <w:t xml:space="preserve"> </w:t>
-      </w:r>
-      <w:r>
-        <w:t xml:space="preserve">오늘 하는 AD DS는 클라이언트가 AD 조인이거나 DC에 접근 가능하면 되고, DC</w:t>
-      </w:r>
-      <w:r>
-        <w:t xml:space="preserve"> </w:t>
-      </w:r>
-      <w:r>
-        <w:t xml:space="preserve">line of sight가 필수입니다. Entra DS는 관리형 도메인용이고요. 다음 세션의</w:t>
-      </w:r>
-      <w:r>
-        <w:t xml:space="preserve"> </w:t>
-      </w:r>
-      <w:r>
-        <w:t xml:space="preserve">Entra Kerberos는 DC 접근이 필요 없고, 사용자는 하이브리드 — 최신 OS라면</w:t>
-      </w:r>
-      <w:r>
-        <w:t xml:space="preserve"> </w:t>
-      </w:r>
-      <w:r>
-        <w:t xml:space="preserve">Entra 전용 계정도 됩니다. 여러분 프로덕션은 어느 열인가요?</w:t>
+        <w:t xml:space="preserve">티켓이 언제 생기고 어디 있는지 봅시다. 순간이 두 번입니다. 첫째,</w:t>
+      </w:r>
+      <w:r>
+        <w:t xml:space="preserve"> </w:t>
+      </w:r>
+      <w:r>
+        <w:t xml:space="preserve">로그인할 때 — DC와 AS 교환을 하고 TGT를 받습니다. 이건 특정 서비스용이 아니라</w:t>
+      </w:r>
+      <w:r>
+        <w:t xml:space="preserve"> </w:t>
+      </w:r>
+      <w:r>
+        <w:t xml:space="preserve">’나는 나다’라는 증명서고, Windows가 LSA 티켓 캐시에 넣어둡니다. 둘째, 마운트할</w:t>
+      </w:r>
+      <w:r>
+        <w:t xml:space="preserve"> </w:t>
+      </w:r>
+      <w:r>
+        <w:t xml:space="preserve">때 — 그 TGT를 내밀고 cifs SPN을 요청해서 서비스 티켓을 받습니다. 이것도 캐시에</w:t>
+      </w:r>
+      <w:r>
+        <w:t xml:space="preserve"> </w:t>
+      </w:r>
+      <w:r>
+        <w:t xml:space="preserve">쌓이고, 접근하는 서비스마다 하나씩 생깁니다. 오른쪽이 그 결과입니다. 로그인만</w:t>
+      </w:r>
+      <w:r>
+        <w:t xml:space="preserve"> </w:t>
+      </w:r>
+      <w:r>
+        <w:t xml:space="preserve">해도 TGT, LDAP, DC의 cifs 티켓이 이미 있고, 공유를 마운트하면 우리 스토리지</w:t>
+      </w:r>
+      <w:r>
+        <w:t xml:space="preserve"> </w:t>
+      </w:r>
+      <w:r>
+        <w:t xml:space="preserve">계정 티켓이 추가됩니다. 이따 실습에서 klist를 치면 이 화면 그대로 보실 겁니다.</w:t>
+      </w:r>
+      <w:r>
+        <w:t xml:space="preserve"> </w:t>
+      </w:r>
+      <w:r>
+        <w:t xml:space="preserve">수명은 10시간, 갱신은 7일이고, klist purge는 캐시만 비우는 거라 다음에 접근하면</w:t>
+      </w:r>
+      <w:r>
+        <w:t xml:space="preserve"> </w:t>
+      </w:r>
+      <w:r>
+        <w:t xml:space="preserve">자동으로 다시 발급됩니다.</w:t>
       </w:r>
       <w:r>
         <w:t xml:space="preserve">”</w:t>
@@ -821,22 +910,49 @@
         <w:t xml:space="preserve"> </w:t>
       </w:r>
       <w:r>
-        <w:t xml:space="preserve">표를 읽지 말고 질문으로 전환. 각주(기본 공유 권한으로 sync</w:t>
-      </w:r>
-      <w:r>
-        <w:t xml:space="preserve"> </w:t>
-      </w:r>
-      <w:r>
-        <w:t xml:space="preserve">없이 동작)는 슬라이드 10에서 다루니 여기선 넘어감.</w:t>
+        <w:t xml:space="preserve">2.5분. 실습에서</w:t>
+      </w:r>
+      <w:r>
+        <w:t xml:space="preserve"> </w:t>
+      </w:r>
+      <w:r>
+        <w:t xml:space="preserve">“</w:t>
+      </w:r>
+      <w:r>
+        <w:t xml:space="preserve">티켓이 왜 이렇게 많냐</w:t>
+      </w:r>
+      <w:r>
+        <w:t xml:space="preserve">”</w:t>
+      </w:r>
+      <w:r>
+        <w:t xml:space="preserve">는 질문이 반드시</w:t>
+      </w:r>
+      <w:r>
+        <w:t xml:space="preserve"> </w:t>
+      </w:r>
+      <w:r>
+        <w:t xml:space="preserve">나오는데, 이 슬라이드가 미리 답입니다.</w:t>
       </w:r>
     </w:p>
     <w:p>
       <w:pPr>
         <w:pStyle w:val="Heading2"/>
       </w:pPr>
-      <w:bookmarkStart w:id="30" w:name="X4fbee0a6b314ce9b306ce6036df4f1d5f752241"/>
-      <w:r>
-        <w:t xml:space="preserve">슬라이드 8 ·</w:t>
+      <w:bookmarkStart w:id="30" w:name="X3be881483cbe191260f843caea0a7f42b4465b4"/>
+      <w:r>
+        <w:t xml:space="preserve">슬라이드 8 · [메커니즘 3/3] 누가 무엇을 열 수 있나 — 1396의 정체 — 0:15</w:t>
+      </w:r>
+      <w:bookmarkEnd w:id="30"/>
+    </w:p>
+    <w:p>
+      <w:pPr>
+        <w:pStyle w:val="FirstParagraph"/>
+      </w:pPr>
+      <w:r>
+        <w:rPr>
+          <w:b/>
+        </w:rPr>
+        <w:t xml:space="preserve">멘트:</w:t>
       </w:r>
       <w:r>
         <w:t xml:space="preserve"> </w:t>
@@ -845,6 +961,184 @@
         <w:t xml:space="preserve">“</w:t>
       </w:r>
       <w:r>
+        <w:t xml:space="preserve">이 세션에서 제일 중요한 슬라이드입니다. Kerberos는 대칭키</w:t>
+      </w:r>
+      <w:r>
+        <w:t xml:space="preserve"> </w:t>
+      </w:r>
+      <w:r>
+        <w:t xml:space="preserve">체계입니다. 티켓은 ’받을 사람의 키’로 잠급니다. 표를 보시면 — TGT는 krbtgt</w:t>
+      </w:r>
+      <w:r>
+        <w:t xml:space="preserve"> </w:t>
+      </w:r>
+      <w:r>
+        <w:t xml:space="preserve">계정 키로 잠기니 KDC만 열 수 있습니다. 클라이언트는 내용을 못 보고 그냥</w:t>
+      </w:r>
+      <w:r>
+        <w:t xml:space="preserve"> </w:t>
+      </w:r>
+      <w:r>
+        <w:t xml:space="preserve">들고 다니는 겁니다. 서비스 티켓은 스토리지 계정의 kerb 키로 잠깁니다. 그래서</w:t>
+      </w:r>
+      <w:r>
+        <w:t xml:space="preserve"> </w:t>
+      </w:r>
+      <w:r>
+        <w:t xml:space="preserve">Azure Files만 열 수 있고, kerb1로 시도하고 안 되면 kerb2로 한 번 더 시도합니다.</w:t>
+      </w:r>
+      <w:r>
+        <w:t xml:space="preserve"> </w:t>
+      </w:r>
+      <w:r>
+        <w:t xml:space="preserve">그런데 둘 다 안 열리면? AD 계정 비밀번호와 스토리지 kerb 키가 서로 어긋난</w:t>
+      </w:r>
+      <w:r>
+        <w:t xml:space="preserve"> </w:t>
+      </w:r>
+      <w:r>
+        <w:t xml:space="preserve">겁니다. KDC는 자기 일을 다 했고 티켓도 멀쩡한데, 서비스가 못 여는 거죠. 이게</w:t>
+      </w:r>
+      <w:r>
+        <w:t xml:space="preserve"> </w:t>
+      </w:r>
+      <w:r>
+        <w:t xml:space="preserve">KRB5KRB_AP_ERR_MODIFIED, 여러분이 보게 될 System error 1396입니다. 이따 Lab</w:t>
+      </w:r>
+      <w:r>
+        <w:t xml:space="preserve"> </w:t>
+      </w:r>
+      <w:r>
+        <w:t xml:space="preserve">2에서 정확히 이 상황을 만들 겁니다.</w:t>
+      </w:r>
+      <w:r>
+        <w:t xml:space="preserve">”</w:t>
+      </w:r>
+    </w:p>
+    <w:p>
+      <w:pPr>
+        <w:pStyle w:val="BodyText"/>
+      </w:pPr>
+      <w:r>
+        <w:rPr>
+          <w:b/>
+        </w:rPr>
+        <w:t xml:space="preserve">진행 메모:</w:t>
+      </w:r>
+      <w:r>
+        <w:t xml:space="preserve"> </w:t>
+      </w:r>
+      <w:r>
+        <w:t xml:space="preserve">2.5분, 이 덱의 클라이맥스. 마지막 문장을 꼭 말할 것 — Lab 2가</w:t>
+      </w:r>
+      <w:r>
+        <w:t xml:space="preserve"> </w:t>
+      </w:r>
+      <w:r>
+        <w:t xml:space="preserve">이 슬라이드의 실습판이라는 연결. 아래 불릿(키 유도, salt)은 RC4 슬라이드의</w:t>
+      </w:r>
+      <w:r>
+        <w:t xml:space="preserve"> </w:t>
+      </w:r>
+      <w:r>
+        <w:t xml:space="preserve">복선.</w:t>
+      </w:r>
+    </w:p>
+    <w:p>
+      <w:pPr>
+        <w:pStyle w:val="Heading2"/>
+      </w:pPr>
+      <w:bookmarkStart w:id="31" w:name="슬라이드-9-three-identity-sources-017"/>
+      <w:r>
+        <w:t xml:space="preserve">슬라이드 9 · Three identity sources — 0:17</w:t>
+      </w:r>
+      <w:bookmarkEnd w:id="31"/>
+    </w:p>
+    <w:p>
+      <w:pPr>
+        <w:pStyle w:val="FirstParagraph"/>
+      </w:pPr>
+      <w:r>
+        <w:rPr>
+          <w:b/>
+        </w:rPr>
+        <w:t xml:space="preserve">멘트:</w:t>
+      </w:r>
+      <w:r>
+        <w:t xml:space="preserve"> </w:t>
+      </w:r>
+      <w:r>
+        <w:t xml:space="preserve">“</w:t>
+      </w:r>
+      <w:r>
+        <w:t xml:space="preserve">identity 소스는 세 가지입니다. 오늘 하는 AD DS는 여러분 DC가</w:t>
+      </w:r>
+      <w:r>
+        <w:t xml:space="preserve"> </w:t>
+      </w:r>
+      <w:r>
+        <w:t xml:space="preserve">티켓을 발급하고 DC 접근이 필수입니다. Entra DS는 관리형 도메인이고요. 다음</w:t>
+      </w:r>
+      <w:r>
+        <w:t xml:space="preserve"> </w:t>
+      </w:r>
+      <w:r>
+        <w:t xml:space="preserve">세션의 Entra Kerberos는 Entra ID가 티켓을 발급해서 DC 접근이 필요 없습니다.</w:t>
+      </w:r>
+      <w:r>
+        <w:t xml:space="preserve"> </w:t>
+      </w:r>
+      <w:r>
+        <w:t xml:space="preserve">아래 각주가 중요한데 — 스토리지 계정 하나에 identity 소스는 하나뿐입니다.</w:t>
+      </w:r>
+      <w:r>
+        <w:t xml:space="preserve"> </w:t>
+      </w:r>
+      <w:r>
+        <w:t xml:space="preserve">그래서 세션 2에서는 이 계정을 AD DS에서 Entra Kerberos로 ’전환’하게 됩니다.</w:t>
+      </w:r>
+      <w:r>
+        <w:t xml:space="preserve"> </w:t>
+      </w:r>
+      <w:r>
+        <w:t xml:space="preserve">여러분 프로덕션은 어느 열인가요?</w:t>
+      </w:r>
+      <w:r>
+        <w:t xml:space="preserve">”</w:t>
+      </w:r>
+    </w:p>
+    <w:p>
+      <w:pPr>
+        <w:pStyle w:val="BodyText"/>
+      </w:pPr>
+      <w:r>
+        <w:rPr>
+          <w:b/>
+        </w:rPr>
+        <w:t xml:space="preserve">진행 메모:</w:t>
+      </w:r>
+      <w:r>
+        <w:t xml:space="preserve"> </w:t>
+      </w:r>
+      <w:r>
+        <w:t xml:space="preserve">표를 읽지 말고 질문으로 전환. 30초~1분이면 충분.</w:t>
+      </w:r>
+    </w:p>
+    <w:p>
+      <w:pPr>
+        <w:pStyle w:val="Heading2"/>
+      </w:pPr>
+      <w:bookmarkStart w:id="32" w:name="Xf1b5d0b2ad57804c725115a2adaa0ecc7c464b3"/>
+      <w:r>
+        <w:t xml:space="preserve">슬라이드 10 ·</w:t>
+      </w:r>
+      <w:r>
+        <w:t xml:space="preserve"> </w:t>
+      </w:r>
+      <w:r>
+        <w:t xml:space="preserve">“</w:t>
+      </w:r>
+      <w:r>
         <w:t xml:space="preserve">Line of sight</w:t>
       </w:r>
       <w:r>
@@ -854,9 +1148,9 @@
         <w:t xml:space="preserve"> </w:t>
       </w:r>
       <w:r>
-        <w:t xml:space="preserve">— what it actually means — 0:14</w:t>
-      </w:r>
-      <w:bookmarkEnd w:id="30"/>
+        <w:t xml:space="preserve">— what it actually means — 0:18</w:t>
+      </w:r>
+      <w:bookmarkEnd w:id="32"/>
     </w:p>
     <w:p>
       <w:pPr>
@@ -921,11 +1215,11 @@
       <w:pPr>
         <w:pStyle w:val="Heading2"/>
       </w:pPr>
-      <w:bookmarkStart w:id="31" w:name="X33d6086db2a814da202a2c3e2e776065ba0232a"/>
-      <w:r>
-        <w:t xml:space="preserve">슬라이드 9 · Happening right now: the RC4 retirement — 0:16</w:t>
-      </w:r>
-      <w:bookmarkEnd w:id="31"/>
+      <w:bookmarkStart w:id="33" w:name="Xbf4cd7a79bdaeb998444134072fa0dd29dd04f0"/>
+      <w:r>
+        <w:t xml:space="preserve">슬라이드 11 · Happening right now: the RC4 retirement — 0:20</w:t>
+      </w:r>
+      <w:bookmarkEnd w:id="33"/>
     </w:p>
     <w:p>
       <w:pPr>
@@ -1024,18 +1318,39 @@
         <w:t xml:space="preserve"> </w:t>
       </w:r>
       <w:r>
-        <w:t xml:space="preserve">몰입도 상승. 각주: Entra Kerberos/DS는 무관.</w:t>
+        <w:t xml:space="preserve">몰입도 상승. 메커니즘 3의</w:t>
+      </w:r>
+      <w:r>
+        <w:t xml:space="preserve"> </w:t>
+      </w:r>
+      <w:r>
+        <w:t xml:space="preserve">“</w:t>
+      </w:r>
+      <w:r>
+        <w:t xml:space="preserve">키는 비밀번호에서 유도된다</w:t>
+      </w:r>
+      <w:r>
+        <w:t xml:space="preserve">”</w:t>
+      </w:r>
+      <w:r>
+        <w:t xml:space="preserve">와 연결해서 설명하면</w:t>
+      </w:r>
+      <w:r>
+        <w:t xml:space="preserve"> </w:t>
+      </w:r>
+      <w:r>
+        <w:t xml:space="preserve">자연스럽습니다. 각주: Entra Kerberos/DS는 무관.</w:t>
       </w:r>
     </w:p>
     <w:p>
       <w:pPr>
         <w:pStyle w:val="Heading2"/>
       </w:pPr>
-      <w:bookmarkStart w:id="32" w:name="X6924a7c63ca9573e709afb12ddcc1bfbef884ee"/>
-      <w:r>
-        <w:t xml:space="preserve">슬라이드 10 · Layer 2 up close: who may enter the share? — 0:18</w:t>
-      </w:r>
-      <w:bookmarkEnd w:id="32"/>
+      <w:bookmarkStart w:id="34" w:name="Xc2b58893a35ece4a88bc77ef427fe7a5e6317cb"/>
+      <w:r>
+        <w:t xml:space="preserve">슬라이드 12 · Auth is only step one: three doors to the data — 0:22</w:t>
+      </w:r>
+      <w:bookmarkEnd w:id="34"/>
     </w:p>
     <w:p>
       <w:pPr>
@@ -1054,55 +1369,37 @@
         <w:t xml:space="preserve">“</w:t>
       </w:r>
       <w:r>
-        <w:t xml:space="preserve">공유 입장 권한은 두 가지 방식이 있습니다. 위는 사용자별 RBAC —</w:t>
-      </w:r>
-      <w:r>
-        <w:t xml:space="preserve"> </w:t>
-      </w:r>
-      <w:r>
-        <w:t xml:space="preserve">프로덕션 정석이지만, 그 사용자가 Entra에 동기화돼 있어야 합니다. 아래는 기본</w:t>
-      </w:r>
-      <w:r>
-        <w:t xml:space="preserve"> </w:t>
-      </w:r>
-      <w:r>
-        <w:t xml:space="preserve">공유 권한 — 인증만 통과하면 모두에게 하나의 역할을 주는 방식이고, 우리 랩이</w:t>
-      </w:r>
-      <w:r>
-        <w:t xml:space="preserve"> </w:t>
-      </w:r>
-      <w:r>
-        <w:t xml:space="preserve">이걸 씁니다. 그래서 sync 없이도 마운트가 되는 겁니다. 주의 하나 — 이 설정은</w:t>
-      </w:r>
-      <w:r>
-        <w:t xml:space="preserve"> </w:t>
-      </w:r>
-      <w:r>
-        <w:t xml:space="preserve">스토리지 계정 안</w:t>
-      </w:r>
-      <w:r>
-        <w:t xml:space="preserve"> </w:t>
-      </w:r>
-      <w:r>
-        <w:t xml:space="preserve">‘</w:t>
-      </w:r>
-      <w:r>
-        <w:t xml:space="preserve">모든</w:t>
-      </w:r>
-      <w:r>
-        <w:t xml:space="preserve">’</w:t>
-      </w:r>
-      <w:r>
-        <w:t xml:space="preserve"> </w:t>
-      </w:r>
-      <w:r>
-        <w:t xml:space="preserve">공유에 적용됩니다. 그리고 RBAC 변경은 반영에 30분까지</w:t>
-      </w:r>
-      <w:r>
-        <w:t xml:space="preserve"> </w:t>
-      </w:r>
-      <w:r>
-        <w:t xml:space="preserve">걸릴 수 있어서, 할당 직후의 실패는 대부분 그냥 전파 대기입니다.</w:t>
+        <w:t xml:space="preserve">인증이 끝나도 문이 세 개 남아 있습니다. 1번 문, 스토리지</w:t>
+      </w:r>
+      <w:r>
+        <w:t xml:space="preserve"> </w:t>
+      </w:r>
+      <w:r>
+        <w:t xml:space="preserve">방화벽과 네트워크 — 445가 막히면 여기서 끝나고 error 53 같은 게 납니다. 2번</w:t>
+      </w:r>
+      <w:r>
+        <w:t xml:space="preserve"> </w:t>
+      </w:r>
+      <w:r>
+        <w:t xml:space="preserve">문, 방금 본 공유 수준 RBAC — 완벽한 Kerberos 티켓을 들고도 여기서 거절될 수</w:t>
+      </w:r>
+      <w:r>
+        <w:t xml:space="preserve"> </w:t>
+      </w:r>
+      <w:r>
+        <w:t xml:space="preserve">있습니다. 3번 문, NTFS ACL — 마운트는 되는데 특정 폴더에서 거절되는</w:t>
+      </w:r>
+      <w:r>
+        <w:t xml:space="preserve"> </w:t>
+      </w:r>
+      <w:r>
+        <w:t xml:space="preserve">경우입니다. 각주가 핵심입니다: ’Kerberos가 고장났어요’라는 문의의 대부분은</w:t>
+      </w:r>
+      <w:r>
+        <w:t xml:space="preserve"> </w:t>
+      </w:r>
+      <w:r>
+        <w:t xml:space="preserve">사실 2번, 3번 문 문제입니다. 항상 물어보세요 — 어느 문인가?</w:t>
       </w:r>
       <w:r>
         <w:t xml:space="preserve">”</w:t>
@@ -1112,11 +1409,11 @@
       <w:pPr>
         <w:pStyle w:val="Heading2"/>
       </w:pPr>
-      <w:bookmarkStart w:id="33" w:name="Xd0fa3fe939f5b90274cb913520e8f22c67e3067"/>
-      <w:r>
-        <w:t xml:space="preserve">슬라이드 11 · Auth is only step one: three doors to the data — 0:20</w:t>
-      </w:r>
-      <w:bookmarkEnd w:id="33"/>
+      <w:bookmarkStart w:id="35" w:name="X3ea4438a30334c6ec28bd5ae6cc6d683bbe3abf"/>
+      <w:r>
+        <w:t xml:space="preserve">슬라이드 13 · Layers 2+3 combine: the effective-access matrix — 0:23</w:t>
+      </w:r>
+      <w:bookmarkEnd w:id="35"/>
     </w:p>
     <w:p>
       <w:pPr>
@@ -1135,37 +1432,49 @@
         <w:t xml:space="preserve">“</w:t>
       </w:r>
       <w:r>
-        <w:t xml:space="preserve">인증이 끝나도 문이 세 개 남아 있습니다. 1번 문, 스토리지</w:t>
-      </w:r>
-      <w:r>
-        <w:t xml:space="preserve"> </w:t>
-      </w:r>
-      <w:r>
-        <w:t xml:space="preserve">방화벽과 네트워크 — 445가 막히면 여기서 끝나고 error 53 같은 게 납니다. 2번</w:t>
-      </w:r>
-      <w:r>
-        <w:t xml:space="preserve"> </w:t>
-      </w:r>
-      <w:r>
-        <w:t xml:space="preserve">문, 방금 본 공유 수준 RBAC — 완벽한 Kerberos 티켓을 들고도 여기서 거절될 수</w:t>
-      </w:r>
-      <w:r>
-        <w:t xml:space="preserve"> </w:t>
-      </w:r>
-      <w:r>
-        <w:t xml:space="preserve">있습니다. 3번 문, NTFS ACL — 마운트는 되는데 특정 폴더에서 거절되는</w:t>
-      </w:r>
-      <w:r>
-        <w:t xml:space="preserve"> </w:t>
-      </w:r>
-      <w:r>
-        <w:t xml:space="preserve">경우입니다. 각주가 핵심입니다: ’Kerberos가 고장났어요’라는 문의의 대부분은</w:t>
-      </w:r>
-      <w:r>
-        <w:t xml:space="preserve"> </w:t>
-      </w:r>
-      <w:r>
-        <w:t xml:space="preserve">사실 2번, 3번 문 문제입니다. 항상 물어보세요 — 어느 문인가?</w:t>
+        <w:t xml:space="preserve">2번 문과 3번 문이 합쳐지면 이 표가 됩니다. 세로가 NTFS, 가로가</w:t>
+      </w:r>
+      <w:r>
+        <w:t xml:space="preserve"> </w:t>
+      </w:r>
+      <w:r>
+        <w:t xml:space="preserve">공유 역할이고, 실제 권한은 둘 중 더 제한적인 쪽입니다. RBAC가 천장, NTFS가</w:t>
+      </w:r>
+      <w:r>
+        <w:t xml:space="preserve"> </w:t>
+      </w:r>
+      <w:r>
+        <w:t xml:space="preserve">바닥이라고 기억하세요. ’NTFS는 Modify인데 거절돼요’는 거의 항상 공유 역할이</w:t>
+      </w:r>
+      <w:r>
+        <w:t xml:space="preserve"> </w:t>
+      </w:r>
+      <w:r>
+        <w:t xml:space="preserve">없는 경우입니다. 아래 박스에 공유 권한 주는 방법 두 가지가 있는데 — 사용자별</w:t>
+      </w:r>
+      <w:r>
+        <w:t xml:space="preserve"> </w:t>
+      </w:r>
+      <w:r>
+        <w:t xml:space="preserve">RBAC는 그 사용자가 Entra에 있어야 하고, 기본 공유 권한은 인증된 모두에게 하나의</w:t>
+      </w:r>
+      <w:r>
+        <w:t xml:space="preserve"> </w:t>
+      </w:r>
+      <w:r>
+        <w:t xml:space="preserve">역할을 줍니다. 우리 랩이 후자를 써서 sync 없이도 마운트가 되는 겁니다. 단, 계정</w:t>
+      </w:r>
+      <w:r>
+        <w:t xml:space="preserve"> </w:t>
+      </w:r>
+      <w:r>
+        <w:t xml:space="preserve">안 모든 공유에 적용된다는 점은 주의하세요. 이따 NoShareAccess 실습이 이 표의</w:t>
+      </w:r>
+      <w:r>
+        <w:t xml:space="preserve"> </w:t>
+      </w:r>
+      <w:r>
+        <w:t xml:space="preserve">공유 열을 None으로 꺾는 실험입니다.</w:t>
       </w:r>
       <w:r>
         <w:t xml:space="preserve">”</w:t>
@@ -1175,147 +1484,9 @@
       <w:pPr>
         <w:pStyle w:val="Heading2"/>
       </w:pPr>
-      <w:bookmarkStart w:id="34" w:name="X9be6ab0279f82a8347b2da1bae78c38e0d2d8f0"/>
-      <w:r>
-        <w:t xml:space="preserve">슬라이드 12 · Layers 2+3 combine: the effective-access matrix — 0:22</w:t>
-      </w:r>
-      <w:bookmarkEnd w:id="34"/>
-    </w:p>
-    <w:p>
-      <w:pPr>
-        <w:pStyle w:val="FirstParagraph"/>
-      </w:pPr>
-      <w:r>
-        <w:rPr>
-          <w:b/>
-        </w:rPr>
-        <w:t xml:space="preserve">멘트:</w:t>
-      </w:r>
-      <w:r>
-        <w:t xml:space="preserve"> </w:t>
-      </w:r>
-      <w:r>
-        <w:t xml:space="preserve">“</w:t>
-      </w:r>
-      <w:r>
-        <w:t xml:space="preserve">2번 문과 3번 문이 합쳐지면 이 표가 됩니다. 세로가 NTFS, 가로가</w:t>
-      </w:r>
-      <w:r>
-        <w:t xml:space="preserve"> </w:t>
-      </w:r>
-      <w:r>
-        <w:t xml:space="preserve">공유 역할이고, 실제 권한은 둘 중 더 제한적인 쪽입니다. RBAC가 천장, NTFS가</w:t>
-      </w:r>
-      <w:r>
-        <w:t xml:space="preserve"> </w:t>
-      </w:r>
-      <w:r>
-        <w:t xml:space="preserve">바닥이라고 기억하세요. ’NTFS는 Modify인데 거절돼요’는 거의 항상 RBAC 역할이</w:t>
-      </w:r>
-      <w:r>
-        <w:t xml:space="preserve"> </w:t>
-      </w:r>
-      <w:r>
-        <w:t xml:space="preserve">없는 경우입니다. 그리고 NTFS ACL을 ’변경’하려면 SMB로는 Elevated</w:t>
-      </w:r>
-      <w:r>
-        <w:t xml:space="preserve"> </w:t>
-      </w:r>
-      <w:r>
-        <w:t xml:space="preserve">Contributor, REST로는 Privileged Contributor, 아니면 스토리지 키가</w:t>
-      </w:r>
-      <w:r>
-        <w:t xml:space="preserve"> </w:t>
-      </w:r>
-      <w:r>
-        <w:t xml:space="preserve">필요합니다. 이따 NoShareAccess 실습이 이 표의 RBAC 열을 None으로 꺾는</w:t>
-      </w:r>
-      <w:r>
-        <w:t xml:space="preserve"> </w:t>
-      </w:r>
-      <w:r>
-        <w:t xml:space="preserve">실험입니다.</w:t>
-      </w:r>
-      <w:r>
-        <w:t xml:space="preserve">”</w:t>
-      </w:r>
-    </w:p>
-    <w:p>
-      <w:pPr>
-        <w:pStyle w:val="Heading2"/>
-      </w:pPr>
-      <w:bookmarkStart w:id="35" w:name="Xe2abdaab68154e1ba108d449f901a20e163594e"/>
-      <w:r>
-        <w:t xml:space="preserve">슬라이드 13 · A sneaky error 5: SMB cipher negotiation — 0:24</w:t>
-      </w:r>
-      <w:bookmarkEnd w:id="35"/>
-    </w:p>
-    <w:p>
-      <w:pPr>
-        <w:pStyle w:val="FirstParagraph"/>
-      </w:pPr>
-      <w:r>
-        <w:rPr>
-          <w:b/>
-        </w:rPr>
-        <w:t xml:space="preserve">멘트:</w:t>
-      </w:r>
-      <w:r>
-        <w:t xml:space="preserve"> </w:t>
-      </w:r>
-      <w:r>
-        <w:t xml:space="preserve">“</w:t>
-      </w:r>
-      <w:r>
-        <w:t xml:space="preserve">교묘한 error 5 하나 소개합니다. 권한이 전부 정상인데 접근</w:t>
-      </w:r>
-      <w:r>
-        <w:t xml:space="preserve"> </w:t>
-      </w:r>
-      <w:r>
-        <w:t xml:space="preserve">거부가 나는 경우 — SMB 암호화 cipher 협상 문제일 수 있습니다. cipher는</w:t>
-      </w:r>
-      <w:r>
-        <w:t xml:space="preserve"> </w:t>
-      </w:r>
-      <w:r>
-        <w:t xml:space="preserve">클라이언트가 계정 이름을 말하기도 전, SMB Negotiate 단계에서 정해지기 때문에</w:t>
-      </w:r>
-      <w:r>
-        <w:t xml:space="preserve"> </w:t>
-      </w:r>
-      <w:r>
-        <w:t xml:space="preserve">서비스가 계정별로 골라줄 수가 없습니다. 계정이 AES-256-GCM만 허용하는데</w:t>
-      </w:r>
-      <w:r>
-        <w:t xml:space="preserve"> </w:t>
-      </w:r>
-      <w:r>
-        <w:t xml:space="preserve">클라이언트가 다른 걸 먼저 내밀면 인증 시작 전에 끊깁니다. 왼쪽 명령으로</w:t>
-      </w:r>
-      <w:r>
-        <w:t xml:space="preserve"> </w:t>
-      </w:r>
-      <w:r>
-        <w:t xml:space="preserve">클라이언트 cipher 순서를 확인하고, 오른쪽처럼 허용된 cipher를 맨 앞으로</w:t>
-      </w:r>
-      <w:r>
-        <w:t xml:space="preserve"> </w:t>
-      </w:r>
-      <w:r>
-        <w:t xml:space="preserve">올리면 됩니다. 순서가 핵심입니다.</w:t>
-      </w:r>
-      <w:r>
-        <w:t xml:space="preserve">”</w:t>
-      </w:r>
-    </w:p>
-    <w:p>
-      <w:pPr>
-        <w:pStyle w:val="Heading2"/>
-      </w:pPr>
-      <w:bookmarkStart w:id="36" w:name="X9159dfdec81ea1dc7215729efe7387d3a5787a0"/>
-      <w:r>
-        <w:t xml:space="preserve">슬라이드 14 · Meanwhile, in your subscription… — 0:26</w:t>
+      <w:bookmarkStart w:id="36" w:name="X7efb1ef0a455239f08db08dc50ba514a7810e5a"/>
+      <w:r>
+        <w:t xml:space="preserve">슬라이드 14 · Meanwhile, in your subscription… — 0:25</w:t>
       </w:r>
       <w:bookmarkEnd w:id="36"/>
     </w:p>
@@ -1706,6 +1877,57 @@
       <w:r>
         <w:t xml:space="preserve">워크북 Lab 3과 동일한 순서.</w:t>
       </w:r>
+      <w:r>
+        <w:t xml:space="preserve"> </w:t>
+      </w:r>
+      <w:r>
+        <w:rPr>
+          <w:b/>
+        </w:rPr>
+        <w:t xml:space="preserve">슬라이드 8(메커니즘 3)로 돌아가</w:t>
+      </w:r>
+      <w:r>
+        <w:rPr>
+          <w:b/>
+        </w:rPr>
+        <w:t xml:space="preserve"> </w:t>
+      </w:r>
+      <w:r>
+        <w:rPr>
+          <w:b/>
+        </w:rPr>
+        <w:t xml:space="preserve">“</w:t>
+      </w:r>
+      <w:r>
+        <w:rPr>
+          <w:b/>
+        </w:rPr>
+        <w:t xml:space="preserve">티켓은 나왔는데</w:t>
+      </w:r>
+      <w:r>
+        <w:rPr>
+          <w:b/>
+        </w:rPr>
+        <w:t xml:space="preserve"> </w:t>
+      </w:r>
+      <w:r>
+        <w:rPr>
+          <w:b/>
+        </w:rPr>
+        <w:t xml:space="preserve">서비스가 못 연다</w:t>
+      </w:r>
+      <w:r>
+        <w:rPr>
+          <w:b/>
+        </w:rPr>
+        <w:t xml:space="preserve">”</w:t>
+      </w:r>
+      <w:r>
+        <w:rPr>
+          <w:b/>
+        </w:rPr>
+        <w:t xml:space="preserve">를 다시 짚어주면 이해가 확 붙습니다.</w:t>
+      </w:r>
     </w:p>
     <w:p>
       <w:pPr>
@@ -2111,6 +2333,110 @@
       </w:r>
     </w:p>
     <w:p>
+      <w:pPr>
+        <w:pStyle w:val="Heading2"/>
+      </w:pPr>
+      <w:bookmarkStart w:id="47" w:name="슬라이드-23-부록-smb-cipher-negotiation-필요할-때만"/>
+      <w:r>
+        <w:t xml:space="preserve">슬라이드 23 · [부록] SMB cipher negotiation — 필요할 때만</w:t>
+      </w:r>
+      <w:bookmarkEnd w:id="47"/>
+    </w:p>
+    <w:p>
+      <w:pPr>
+        <w:pStyle w:val="FirstParagraph"/>
+      </w:pPr>
+      <w:r>
+        <w:rPr>
+          <w:b/>
+        </w:rPr>
+        <w:t xml:space="preserve">멘트(질문 나올 때만):</w:t>
+      </w:r>
+      <w:r>
+        <w:t xml:space="preserve"> </w:t>
+      </w:r>
+      <w:r>
+        <w:t xml:space="preserve">“</w:t>
+      </w:r>
+      <w:r>
+        <w:t xml:space="preserve">권한이 전부 정상인데 error 5가 난다면 SMB</w:t>
+      </w:r>
+      <w:r>
+        <w:t xml:space="preserve"> </w:t>
+      </w:r>
+      <w:r>
+        <w:t xml:space="preserve">암호화 cipher 협상 문제일 수 있습니다. cipher는 클라이언트가 계정 이름을</w:t>
+      </w:r>
+      <w:r>
+        <w:t xml:space="preserve"> </w:t>
+      </w:r>
+      <w:r>
+        <w:t xml:space="preserve">말하기도 전에 정해지기 때문에 서비스가 계정별로 골라줄 수가 없습니다. 계정이</w:t>
+      </w:r>
+      <w:r>
+        <w:t xml:space="preserve"> </w:t>
+      </w:r>
+      <w:r>
+        <w:t xml:space="preserve">AES-256-GCM만 허용하는데 클라이언트가 다른 걸 먼저 내밀면 인증 시작 전에</w:t>
+      </w:r>
+      <w:r>
+        <w:t xml:space="preserve"> </w:t>
+      </w:r>
+      <w:r>
+        <w:t xml:space="preserve">끊깁니다. 클라이언트 cipher 순서를 확인하고, 허용된 걸 맨 앞으로 올리면</w:t>
+      </w:r>
+      <w:r>
+        <w:t xml:space="preserve"> </w:t>
+      </w:r>
+      <w:r>
+        <w:t xml:space="preserve">됩니다.</w:t>
+      </w:r>
+      <w:r>
+        <w:t xml:space="preserve">”</w:t>
+      </w:r>
+    </w:p>
+    <w:p>
+      <w:pPr>
+        <w:pStyle w:val="BodyText"/>
+      </w:pPr>
+      <w:r>
+        <w:rPr>
+          <w:b/>
+        </w:rPr>
+        <w:t xml:space="preserve">진행 메모:</w:t>
+      </w:r>
+      <w:r>
+        <w:t xml:space="preserve"> </w:t>
+      </w:r>
+      <w:r>
+        <w:t xml:space="preserve">정규 진행에서는 건너뜀.</w:t>
+      </w:r>
+      <w:r>
+        <w:t xml:space="preserve"> </w:t>
+      </w:r>
+      <w:r>
+        <w:t xml:space="preserve">“</w:t>
+      </w:r>
+      <w:r>
+        <w:t xml:space="preserve">권한 다 맞는데 5번 에러</w:t>
+      </w:r>
+      <w:r>
+        <w:t xml:space="preserve">”</w:t>
+      </w:r>
+      <w:r>
+        <w:t xml:space="preserve"> </w:t>
+      </w:r>
+      <w:r>
+        <w:t xml:space="preserve">질문이</w:t>
+      </w:r>
+      <w:r>
+        <w:t xml:space="preserve"> </w:t>
+      </w:r>
+      <w:r>
+        <w:t xml:space="preserve">나오면 이 슬라이드로 점프.</w:t>
+      </w:r>
+    </w:p>
+    <w:p>
       <w:r>
         <w:pict>
           <v:rect style="width:0;height:1.5pt" o:hralign="center" o:hrstd="t" o:hr="t"/>
@@ -2121,11 +2447,11 @@
       <w:pPr>
         <w:pStyle w:val="Heading1"/>
       </w:pPr>
-      <w:bookmarkStart w:id="47" w:name="비상-대응-요약-발표자용"/>
+      <w:bookmarkStart w:id="48" w:name="비상-대응-요약-발표자용"/>
       <w:r>
         <w:t xml:space="preserve">비상 대응 요약 (발표자용)</w:t>
       </w:r>
-      <w:bookmarkEnd w:id="47"/>
+      <w:bookmarkEnd w:id="48"/>
     </w:p>
     <w:p>
       <w:pPr>

</xml_diff>